<commit_message>
uncommented q6 and completed q6 on report
</commit_message>
<xml_diff>
--- a/06 - Lab - Data Structure Basics/Task 06 - Lab Report.docx
+++ b/06 - Lab - Data Structure Basics/Task 06 - Lab Report.docx
@@ -79,15 +79,7 @@
         <w:t xml:space="preserve">1.1. </w:t>
       </w:r>
       <w:r>
-        <w:t xml:space="preserve">They are used to specify template arguments in C++. With </w:t>
-      </w:r>
-      <w:proofErr w:type="gramStart"/>
-      <w:r>
-        <w:t>std::</w:t>
-      </w:r>
-      <w:proofErr w:type="gramEnd"/>
-      <w:r>
-        <w:t>array, they define the type and fixed size of the array.</w:t>
+        <w:t>They are used to specify template arguments in C++. With std::array, they define the type and fixed size of the array.</w:t>
       </w:r>
     </w:p>
     <w:p>
@@ -96,17 +88,7 @@
         <w:ind w:left="720"/>
       </w:pPr>
       <w:r>
-        <w:t xml:space="preserve">Q.1.2 [line 167] Why don't we need to write </w:t>
-      </w:r>
-      <w:proofErr w:type="spellStart"/>
-      <w:proofErr w:type="gramStart"/>
-      <w:r>
-        <w:t>std:array</w:t>
-      </w:r>
-      <w:proofErr w:type="spellEnd"/>
-      <w:proofErr w:type="gramEnd"/>
-      <w:r>
-        <w:t xml:space="preserve"> here? (Is this good?) </w:t>
+        <w:t xml:space="preserve">Q.1.2 [line 167] Why don't we need to write std:array here? (Is this good?) </w:t>
       </w:r>
     </w:p>
     <w:p>
@@ -163,23 +145,7 @@
         <w:t xml:space="preserve">1.4. </w:t>
       </w:r>
       <w:r>
-        <w:t xml:space="preserve">The type of itr2 is an iterator to the </w:t>
-      </w:r>
-      <w:proofErr w:type="gramStart"/>
-      <w:r>
-        <w:t>std::</w:t>
-      </w:r>
-      <w:proofErr w:type="gramEnd"/>
-      <w:r>
-        <w:t xml:space="preserve">array&lt;int, 3&gt;. Specifically, it's </w:t>
-      </w:r>
-      <w:proofErr w:type="gramStart"/>
-      <w:r>
-        <w:t>std::</w:t>
-      </w:r>
-      <w:proofErr w:type="gramEnd"/>
-      <w:r>
-        <w:t>array&lt;int, 3&gt;::iterator. The use of auto lets the compiler deduce this type automatically.</w:t>
+        <w:t>The type of itr2 is an iterator to the std::array&lt;int, 3&gt;. Specifically, it's std::array&lt;int, 3&gt;::iterator. The use of auto lets the compiler deduce this type automatically.</w:t>
       </w:r>
     </w:p>
     <w:p>
@@ -216,15 +182,7 @@
         <w:ind w:left="720"/>
       </w:pPr>
       <w:r>
-        <w:t>Q.1.6 [line 214] In the code above, what does the &amp; mean in (auto &amp;</w:t>
-      </w:r>
-      <w:proofErr w:type="gramStart"/>
-      <w:r>
-        <w:t>v :</w:t>
-      </w:r>
-      <w:proofErr w:type="gramEnd"/>
-      <w:r>
-        <w:t xml:space="preserve"> a1) </w:t>
+        <w:t xml:space="preserve">Q.1.6 [line 214] In the code above, what does the &amp; mean in (auto &amp;v : a1) </w:t>
       </w:r>
     </w:p>
     <w:p>
@@ -261,15 +219,7 @@
       </w:pPr>
       <w:r>
         <w:lastRenderedPageBreak/>
-        <w:t xml:space="preserve">Q.1.7 [line 222] Try this. Why does a1[3] work but </w:t>
-      </w:r>
-      <w:proofErr w:type="gramStart"/>
-      <w:r>
-        <w:t>at(</w:t>
-      </w:r>
-      <w:proofErr w:type="gramEnd"/>
-      <w:r>
-        <w:t xml:space="preserve">3) does not? </w:t>
+        <w:t xml:space="preserve">Q.1.7 [line 222] Try this. Why does a1[3] work but at(3) does not? </w:t>
       </w:r>
     </w:p>
     <w:p>
@@ -279,34 +229,10 @@
         <w:jc w:val="both"/>
       </w:pPr>
       <w:r>
-        <w:t xml:space="preserve">1.7. </w:t>
-      </w:r>
-      <w:proofErr w:type="gramStart"/>
-      <w:r>
-        <w:t>Because,</w:t>
-      </w:r>
-      <w:proofErr w:type="gramEnd"/>
-      <w:r>
-        <w:t xml:space="preserve"> </w:t>
-      </w:r>
-      <w:r>
-        <w:t xml:space="preserve">a1[3] accesses the array without checking boundaries, which can be risky. Meanwhile, </w:t>
-      </w:r>
-      <w:proofErr w:type="gramStart"/>
-      <w:r>
-        <w:t>a1.at(</w:t>
-      </w:r>
-      <w:proofErr w:type="gramEnd"/>
-      <w:r>
-        <w:t xml:space="preserve">3) checks if the index is valid and throws an error if it's out of bounds. The </w:t>
-      </w:r>
-      <w:proofErr w:type="gramStart"/>
-      <w:r>
-        <w:t>at(</w:t>
-      </w:r>
-      <w:proofErr w:type="gramEnd"/>
-      <w:r>
-        <w:t>) method is safer because of this check.</w:t>
+        <w:t xml:space="preserve">1.7. Because, </w:t>
+      </w:r>
+      <w:r>
+        <w:t>a1[3] accesses the array without checking boundaries, which can be risky. Meanwhile, a1.at(3) checks if the index is valid and throws an error if it's out of bounds. The at() method is safer because of this check.</w:t>
       </w:r>
     </w:p>
     <w:p>
@@ -315,15 +241,7 @@
         <w:ind w:left="720"/>
       </w:pPr>
       <w:r>
-        <w:t xml:space="preserve">Q.1.8 [line 235] auto is awesome. What is the actual type of v </w:t>
-      </w:r>
-      <w:proofErr w:type="gramStart"/>
-      <w:r>
-        <w:t>that it</w:t>
-      </w:r>
-      <w:proofErr w:type="gramEnd"/>
-      <w:r>
-        <w:t xml:space="preserve"> works out for us?</w:t>
+        <w:t>Q.1.8 [line 235] auto is awesome. What is the actual type of v that it works out for us?</w:t>
       </w:r>
     </w:p>
     <w:p>
@@ -398,15 +316,7 @@
         <w:t xml:space="preserve"> could</w:t>
       </w:r>
       <w:r>
-        <w:t xml:space="preserve"> use the sort function with the begin and end iterators of the array: sort(a</w:t>
-      </w:r>
-      <w:proofErr w:type="gramStart"/>
-      <w:r>
-        <w:t>1.begin</w:t>
-      </w:r>
-      <w:proofErr w:type="gramEnd"/>
-      <w:r>
-        <w:t>(), a1.end());.</w:t>
+        <w:t xml:space="preserve"> use the sort function with the begin and end iterators of the array: sort(a1.begin(), a1.end());.</w:t>
       </w:r>
     </w:p>
     <w:p>
@@ -429,6 +339,7 @@
       <w:pPr>
         <w:spacing w:line="360" w:lineRule="auto"/>
         <w:ind w:left="720"/>
+        <w:jc w:val="both"/>
       </w:pPr>
       <w:r>
         <w:t>Answer: a4(a1) initializes the a4 array by copying the contents of a1. It's a copy constructor call.</w:t>
@@ -454,17 +365,10 @@
       <w:pPr>
         <w:spacing w:line="360" w:lineRule="auto"/>
         <w:ind w:left="720"/>
-      </w:pPr>
-      <w:r>
-        <w:t xml:space="preserve">I just ran </w:t>
-      </w:r>
-      <w:proofErr w:type="gramStart"/>
-      <w:r>
-        <w:t>the a</w:t>
-      </w:r>
-      <w:proofErr w:type="gramEnd"/>
-      <w:r>
-        <w:t xml:space="preserve"> breakpoint on array_demo_3 just to see what it does.</w:t>
+        <w:jc w:val="both"/>
+      </w:pPr>
+      <w:r>
+        <w:t>I just ran the a breakpoint on array_demo_3 just to see what it does.</w:t>
       </w:r>
     </w:p>
     <w:p>
@@ -487,71 +391,33 @@
       <w:pPr>
         <w:spacing w:line="360" w:lineRule="auto"/>
         <w:ind w:left="720"/>
-      </w:pPr>
-      <w:r>
-        <w:t xml:space="preserve">We use </w:t>
-      </w:r>
-      <w:proofErr w:type="gramStart"/>
-      <w:r>
-        <w:t>push(</w:t>
-      </w:r>
-      <w:proofErr w:type="gramEnd"/>
-      <w:r>
-        <w:t>) to add and pop() to remove items from a stack.</w:t>
-      </w:r>
-    </w:p>
-    <w:p>
-      <w:pPr>
-        <w:spacing w:line="360" w:lineRule="auto"/>
-        <w:rPr>
-          <w:sz w:val="28"/>
-          <w:szCs w:val="28"/>
-        </w:rPr>
-      </w:pPr>
-      <w:r>
-        <w:rPr>
-          <w:sz w:val="28"/>
-          <w:szCs w:val="28"/>
-        </w:rPr>
-        <w:t xml:space="preserve">Q.5 [line 114] A stack has no </w:t>
-      </w:r>
-      <w:proofErr w:type="spellStart"/>
-      <w:r>
-        <w:rPr>
-          <w:sz w:val="28"/>
-          <w:szCs w:val="28"/>
-        </w:rPr>
-        <w:t>no</w:t>
-      </w:r>
-      <w:proofErr w:type="spellEnd"/>
-      <w:r>
-        <w:rPr>
-          <w:sz w:val="28"/>
-          <w:szCs w:val="28"/>
-        </w:rPr>
-        <w:t xml:space="preserve"> [] or </w:t>
-      </w:r>
-      <w:proofErr w:type="gramStart"/>
-      <w:r>
-        <w:rPr>
-          <w:sz w:val="28"/>
-          <w:szCs w:val="28"/>
-        </w:rPr>
-        <w:t>at(</w:t>
-      </w:r>
-      <w:proofErr w:type="gramEnd"/>
-      <w:r>
-        <w:rPr>
-          <w:sz w:val="28"/>
-          <w:szCs w:val="28"/>
-        </w:rPr>
-        <w:t>) method - why?</w:t>
+        <w:jc w:val="both"/>
+      </w:pPr>
+      <w:r>
+        <w:t>We use push() to add and pop() to remove items from a stack.</w:t>
+      </w:r>
+    </w:p>
+    <w:p>
+      <w:pPr>
+        <w:spacing w:line="360" w:lineRule="auto"/>
+        <w:rPr>
+          <w:sz w:val="28"/>
+          <w:szCs w:val="28"/>
+        </w:rPr>
+      </w:pPr>
+      <w:r>
+        <w:rPr>
+          <w:sz w:val="28"/>
+          <w:szCs w:val="28"/>
+        </w:rPr>
+        <w:t>Q.5 [line 114] A stack has no no [] or at() method - why?</w:t>
       </w:r>
     </w:p>
     <w:p>
       <w:pPr>
         <w:spacing w:line="360" w:lineRule="auto"/>
         <w:ind w:left="720"/>
+        <w:jc w:val="both"/>
       </w:pPr>
       <w:r>
         <w:t>A stack is designed as a Last-In-First-Out (LIFO) data structure, meaning you only have access to the top element. Direct indexing would violate this principle.</w:t>
@@ -571,48 +437,29 @@
           <w:szCs w:val="28"/>
         </w:rPr>
         <w:lastRenderedPageBreak/>
-        <w:t xml:space="preserve">Q.6 [line 117] What is the difference between a </w:t>
-      </w:r>
-      <w:proofErr w:type="spellStart"/>
-      <w:proofErr w:type="gramStart"/>
-      <w:r>
-        <w:rPr>
-          <w:sz w:val="28"/>
-          <w:szCs w:val="28"/>
-        </w:rPr>
-        <w:t>stack.pop</w:t>
-      </w:r>
-      <w:proofErr w:type="spellEnd"/>
-      <w:r>
-        <w:rPr>
-          <w:sz w:val="28"/>
-          <w:szCs w:val="28"/>
-        </w:rPr>
-        <w:t>(</w:t>
-      </w:r>
-      <w:proofErr w:type="gramEnd"/>
-      <w:r>
-        <w:rPr>
-          <w:sz w:val="28"/>
-          <w:szCs w:val="28"/>
-        </w:rPr>
-        <w:t xml:space="preserve">) and a </w:t>
-      </w:r>
-      <w:proofErr w:type="spellStart"/>
-      <w:r>
-        <w:rPr>
-          <w:sz w:val="28"/>
-          <w:szCs w:val="28"/>
-        </w:rPr>
-        <w:t>queue.pop</w:t>
-      </w:r>
-      <w:proofErr w:type="spellEnd"/>
-      <w:r>
-        <w:rPr>
-          <w:sz w:val="28"/>
-          <w:szCs w:val="28"/>
-        </w:rPr>
-        <w:t xml:space="preserve">() ? </w:t>
+        <w:t xml:space="preserve">Q.6 [line 117] What is the difference between a stack.pop() and a queue.pop() ? </w:t>
+      </w:r>
+    </w:p>
+    <w:p>
+      <w:pPr>
+        <w:spacing w:line="360" w:lineRule="auto"/>
+        <w:ind w:left="720"/>
+        <w:jc w:val="both"/>
+      </w:pPr>
+      <w:r>
+        <w:t xml:space="preserve">A </w:t>
+      </w:r>
+      <w:r>
+        <w:t xml:space="preserve">stack.pop() removes the item from the top (last added item), whereas </w:t>
+      </w:r>
+      <w:r>
+        <w:t xml:space="preserve">a </w:t>
+      </w:r>
+      <w:r>
+        <w:t>queue.pop() removes the item from the front</w:t>
+      </w:r>
+      <w:r>
+        <w:t>.</w:t>
       </w:r>
     </w:p>
     <w:p>
@@ -660,87 +507,39 @@
           <w:sz w:val="28"/>
           <w:szCs w:val="28"/>
         </w:rPr>
-        <w:t xml:space="preserve">Q.9 [line 124] Was </w:t>
-      </w:r>
-      <w:proofErr w:type="spellStart"/>
-      <w:r>
-        <w:rPr>
-          <w:sz w:val="28"/>
-          <w:szCs w:val="28"/>
-        </w:rPr>
-        <w:t>max_size</w:t>
-      </w:r>
-      <w:proofErr w:type="spellEnd"/>
-      <w:r>
-        <w:rPr>
-          <w:sz w:val="28"/>
-          <w:szCs w:val="28"/>
-        </w:rPr>
-        <w:t xml:space="preserve"> and size the same? (Can they be different?) </w:t>
-      </w:r>
-    </w:p>
-    <w:p>
-      <w:pPr>
-        <w:spacing w:line="360" w:lineRule="auto"/>
-        <w:rPr>
-          <w:sz w:val="28"/>
-          <w:szCs w:val="28"/>
-        </w:rPr>
-      </w:pPr>
-      <w:r>
-        <w:rPr>
-          <w:sz w:val="28"/>
-          <w:szCs w:val="28"/>
-        </w:rPr>
-        <w:t xml:space="preserve">Q.10 [line 125] Which </w:t>
-      </w:r>
-      <w:proofErr w:type="spellStart"/>
-      <w:r>
-        <w:rPr>
-          <w:sz w:val="28"/>
-          <w:szCs w:val="28"/>
-        </w:rPr>
-        <w:t>ParticleClass</w:t>
-      </w:r>
-      <w:proofErr w:type="spellEnd"/>
-      <w:r>
-        <w:rPr>
-          <w:sz w:val="28"/>
-          <w:szCs w:val="28"/>
-        </w:rPr>
-        <w:t xml:space="preserve"> constructor was called? </w:t>
-      </w:r>
-    </w:p>
-    <w:p>
-      <w:pPr>
-        <w:spacing w:line="360" w:lineRule="auto"/>
-        <w:rPr>
-          <w:sz w:val="28"/>
-          <w:szCs w:val="28"/>
-        </w:rPr>
-      </w:pPr>
-      <w:r>
-        <w:rPr>
-          <w:sz w:val="28"/>
-          <w:szCs w:val="28"/>
-        </w:rPr>
-        <w:t xml:space="preserve">Q.11 [line 126] Were the </w:t>
-      </w:r>
-      <w:proofErr w:type="spellStart"/>
-      <w:r>
-        <w:rPr>
-          <w:sz w:val="28"/>
-          <w:szCs w:val="28"/>
-        </w:rPr>
-        <w:t>ParticleClass</w:t>
-      </w:r>
-      <w:proofErr w:type="spellEnd"/>
-      <w:r>
-        <w:rPr>
-          <w:sz w:val="28"/>
-          <w:szCs w:val="28"/>
-        </w:rPr>
-        <w:t xml:space="preserve"> instances deleted? If so, how? </w:t>
+        <w:t xml:space="preserve">Q.9 [line 124] Was max_size and size the same? (Can they be different?) </w:t>
+      </w:r>
+    </w:p>
+    <w:p>
+      <w:pPr>
+        <w:spacing w:line="360" w:lineRule="auto"/>
+        <w:rPr>
+          <w:sz w:val="28"/>
+          <w:szCs w:val="28"/>
+        </w:rPr>
+      </w:pPr>
+      <w:r>
+        <w:rPr>
+          <w:sz w:val="28"/>
+          <w:szCs w:val="28"/>
+        </w:rPr>
+        <w:t xml:space="preserve">Q.10 [line 125] Which ParticleClass constructor was called? </w:t>
+      </w:r>
+    </w:p>
+    <w:p>
+      <w:pPr>
+        <w:spacing w:line="360" w:lineRule="auto"/>
+        <w:rPr>
+          <w:sz w:val="28"/>
+          <w:szCs w:val="28"/>
+        </w:rPr>
+      </w:pPr>
+      <w:r>
+        <w:rPr>
+          <w:sz w:val="28"/>
+          <w:szCs w:val="28"/>
+        </w:rPr>
+        <w:t xml:space="preserve">Q.11 [line 126] Were the ParticleClass instances deleted? If so, how? </w:t>
       </w:r>
     </w:p>
     <w:p>
@@ -772,55 +571,7 @@
           <w:sz w:val="28"/>
           <w:szCs w:val="28"/>
         </w:rPr>
-        <w:t xml:space="preserve">Q.13 [line 128] Your IDE might suggest </w:t>
-      </w:r>
-      <w:proofErr w:type="gramStart"/>
-      <w:r>
-        <w:rPr>
-          <w:sz w:val="28"/>
-          <w:szCs w:val="28"/>
-        </w:rPr>
-        <w:t>to use</w:t>
-      </w:r>
-      <w:proofErr w:type="gramEnd"/>
-      <w:r>
-        <w:rPr>
-          <w:sz w:val="28"/>
-          <w:szCs w:val="28"/>
-        </w:rPr>
-        <w:t xml:space="preserve"> </w:t>
-      </w:r>
-      <w:proofErr w:type="spellStart"/>
-      <w:r>
-        <w:rPr>
-          <w:sz w:val="28"/>
-          <w:szCs w:val="28"/>
-        </w:rPr>
-        <w:t>emplace_back</w:t>
-      </w:r>
-      <w:proofErr w:type="spellEnd"/>
-      <w:r>
-        <w:rPr>
-          <w:sz w:val="28"/>
-          <w:szCs w:val="28"/>
-        </w:rPr>
-        <w:t xml:space="preserve"> instead of </w:t>
-      </w:r>
-      <w:proofErr w:type="spellStart"/>
-      <w:r>
-        <w:rPr>
-          <w:sz w:val="28"/>
-          <w:szCs w:val="28"/>
-        </w:rPr>
-        <w:t>push_back</w:t>
-      </w:r>
-      <w:proofErr w:type="spellEnd"/>
-      <w:r>
-        <w:rPr>
-          <w:sz w:val="28"/>
-          <w:szCs w:val="28"/>
-        </w:rPr>
-        <w:t xml:space="preserve">. What does this mean? </w:t>
+        <w:t xml:space="preserve">Q.13 [line 128] Your IDE might suggest to use emplace_back instead of push_back. What does this mean? </w:t>
       </w:r>
     </w:p>
     <w:sectPr>

</xml_diff>

<commit_message>
uncomment q7 n q8 completed questions in doc
</commit_message>
<xml_diff>
--- a/06 - Lab - Data Structure Basics/Task 06 - Lab Report.docx
+++ b/06 - Lab - Data Structure Basics/Task 06 - Lab Report.docx
@@ -88,7 +88,15 @@
         <w:ind w:left="720"/>
       </w:pPr>
       <w:r>
-        <w:t xml:space="preserve">Q.1.2 [line 167] Why don't we need to write std:array here? (Is this good?) </w:t>
+        <w:t xml:space="preserve">Q.1.2 [line 167] Why don't we need to write </w:t>
+      </w:r>
+      <w:proofErr w:type="spellStart"/>
+      <w:r>
+        <w:t>std:array</w:t>
+      </w:r>
+      <w:proofErr w:type="spellEnd"/>
+      <w:r>
+        <w:t xml:space="preserve"> here? (Is this good?) </w:t>
       </w:r>
     </w:p>
     <w:p>
@@ -410,7 +418,23 @@
           <w:sz w:val="28"/>
           <w:szCs w:val="28"/>
         </w:rPr>
-        <w:t>Q.5 [line 114] A stack has no no [] or at() method - why?</w:t>
+        <w:t xml:space="preserve">Q.5 [line 114] A stack has no </w:t>
+      </w:r>
+      <w:proofErr w:type="spellStart"/>
+      <w:r>
+        <w:rPr>
+          <w:sz w:val="28"/>
+          <w:szCs w:val="28"/>
+        </w:rPr>
+        <w:t>no</w:t>
+      </w:r>
+      <w:proofErr w:type="spellEnd"/>
+      <w:r>
+        <w:rPr>
+          <w:sz w:val="28"/>
+          <w:szCs w:val="28"/>
+        </w:rPr>
+        <w:t xml:space="preserve"> [] or at() method - why?</w:t>
       </w:r>
     </w:p>
     <w:p>
@@ -437,7 +461,39 @@
           <w:szCs w:val="28"/>
         </w:rPr>
         <w:lastRenderedPageBreak/>
-        <w:t xml:space="preserve">Q.6 [line 117] What is the difference between a stack.pop() and a queue.pop() ? </w:t>
+        <w:t xml:space="preserve">Q.6 [line 117] What is the difference between a </w:t>
+      </w:r>
+      <w:proofErr w:type="spellStart"/>
+      <w:r>
+        <w:rPr>
+          <w:sz w:val="28"/>
+          <w:szCs w:val="28"/>
+        </w:rPr>
+        <w:t>stack.pop</w:t>
+      </w:r>
+      <w:proofErr w:type="spellEnd"/>
+      <w:r>
+        <w:rPr>
+          <w:sz w:val="28"/>
+          <w:szCs w:val="28"/>
+        </w:rPr>
+        <w:t xml:space="preserve">() and a </w:t>
+      </w:r>
+      <w:proofErr w:type="spellStart"/>
+      <w:r>
+        <w:rPr>
+          <w:sz w:val="28"/>
+          <w:szCs w:val="28"/>
+        </w:rPr>
+        <w:t>queue.pop</w:t>
+      </w:r>
+      <w:proofErr w:type="spellEnd"/>
+      <w:r>
+        <w:rPr>
+          <w:sz w:val="28"/>
+          <w:szCs w:val="28"/>
+        </w:rPr>
+        <w:t xml:space="preserve">() ? </w:t>
       </w:r>
     </w:p>
     <w:p>
@@ -449,14 +505,24 @@
       <w:r>
         <w:t xml:space="preserve">A </w:t>
       </w:r>
-      <w:r>
-        <w:t xml:space="preserve">stack.pop() removes the item from the top (last added item), whereas </w:t>
+      <w:proofErr w:type="spellStart"/>
+      <w:r>
+        <w:t>stack.pop</w:t>
+      </w:r>
+      <w:proofErr w:type="spellEnd"/>
+      <w:r>
+        <w:t xml:space="preserve">() removes the item from the top (last added item), whereas </w:t>
       </w:r>
       <w:r>
         <w:t xml:space="preserve">a </w:t>
       </w:r>
-      <w:r>
-        <w:t>queue.pop() removes the item from the front</w:t>
+      <w:proofErr w:type="spellStart"/>
+      <w:r>
+        <w:t>queue.pop</w:t>
+      </w:r>
+      <w:proofErr w:type="spellEnd"/>
+      <w:r>
+        <w:t>() removes the item from the front</w:t>
       </w:r>
       <w:r>
         <w:t>.</w:t>
@@ -475,7 +541,35 @@
           <w:sz w:val="28"/>
           <w:szCs w:val="28"/>
         </w:rPr>
-        <w:t xml:space="preserve">Q.7 [line 120] Can we access a list value using and int index? Explain. </w:t>
+        <w:t>Q.7 [line 120] Can we access a list value using and int index? Explain.</w:t>
+      </w:r>
+    </w:p>
+    <w:p>
+      <w:pPr>
+        <w:spacing w:line="360" w:lineRule="auto"/>
+        <w:ind w:left="720"/>
+        <w:jc w:val="both"/>
+      </w:pPr>
+      <w:r>
+        <w:t>No</w:t>
+      </w:r>
+      <w:r>
+        <w:t>t really because</w:t>
+      </w:r>
+      <w:r>
+        <w:t xml:space="preserve"> lists in C++ are doubly-linked lists</w:t>
+      </w:r>
+      <w:r>
+        <w:t xml:space="preserve"> and</w:t>
+      </w:r>
+      <w:r>
+        <w:t xml:space="preserve"> </w:t>
+      </w:r>
+      <w:r>
+        <w:t>t</w:t>
+      </w:r>
+      <w:r>
+        <w:t>hey do not support direct indexing like arrays because accessing elements requires traversal from the beginning or end of the list.</w:t>
       </w:r>
     </w:p>
     <w:p>
@@ -507,39 +601,87 @@
           <w:sz w:val="28"/>
           <w:szCs w:val="28"/>
         </w:rPr>
-        <w:t xml:space="preserve">Q.9 [line 124] Was max_size and size the same? (Can they be different?) </w:t>
-      </w:r>
-    </w:p>
-    <w:p>
-      <w:pPr>
-        <w:spacing w:line="360" w:lineRule="auto"/>
-        <w:rPr>
-          <w:sz w:val="28"/>
-          <w:szCs w:val="28"/>
-        </w:rPr>
-      </w:pPr>
-      <w:r>
-        <w:rPr>
-          <w:sz w:val="28"/>
-          <w:szCs w:val="28"/>
-        </w:rPr>
-        <w:t xml:space="preserve">Q.10 [line 125] Which ParticleClass constructor was called? </w:t>
-      </w:r>
-    </w:p>
-    <w:p>
-      <w:pPr>
-        <w:spacing w:line="360" w:lineRule="auto"/>
-        <w:rPr>
-          <w:sz w:val="28"/>
-          <w:szCs w:val="28"/>
-        </w:rPr>
-      </w:pPr>
-      <w:r>
-        <w:rPr>
-          <w:sz w:val="28"/>
-          <w:szCs w:val="28"/>
-        </w:rPr>
-        <w:t xml:space="preserve">Q.11 [line 126] Were the ParticleClass instances deleted? If so, how? </w:t>
+        <w:t xml:space="preserve">Q.9 [line 124] Was </w:t>
+      </w:r>
+      <w:proofErr w:type="spellStart"/>
+      <w:r>
+        <w:rPr>
+          <w:sz w:val="28"/>
+          <w:szCs w:val="28"/>
+        </w:rPr>
+        <w:t>max_size</w:t>
+      </w:r>
+      <w:proofErr w:type="spellEnd"/>
+      <w:r>
+        <w:rPr>
+          <w:sz w:val="28"/>
+          <w:szCs w:val="28"/>
+        </w:rPr>
+        <w:t xml:space="preserve"> and size the same? (Can they be different?) </w:t>
+      </w:r>
+    </w:p>
+    <w:p>
+      <w:pPr>
+        <w:spacing w:line="360" w:lineRule="auto"/>
+        <w:rPr>
+          <w:sz w:val="28"/>
+          <w:szCs w:val="28"/>
+        </w:rPr>
+      </w:pPr>
+      <w:r>
+        <w:rPr>
+          <w:sz w:val="28"/>
+          <w:szCs w:val="28"/>
+        </w:rPr>
+        <w:t xml:space="preserve">Q.10 [line 125] Which </w:t>
+      </w:r>
+      <w:proofErr w:type="spellStart"/>
+      <w:r>
+        <w:rPr>
+          <w:sz w:val="28"/>
+          <w:szCs w:val="28"/>
+        </w:rPr>
+        <w:t>ParticleClass</w:t>
+      </w:r>
+      <w:proofErr w:type="spellEnd"/>
+      <w:r>
+        <w:rPr>
+          <w:sz w:val="28"/>
+          <w:szCs w:val="28"/>
+        </w:rPr>
+        <w:t xml:space="preserve"> constructor was called? </w:t>
+      </w:r>
+    </w:p>
+    <w:p>
+      <w:pPr>
+        <w:spacing w:line="360" w:lineRule="auto"/>
+        <w:rPr>
+          <w:sz w:val="28"/>
+          <w:szCs w:val="28"/>
+        </w:rPr>
+      </w:pPr>
+      <w:r>
+        <w:rPr>
+          <w:sz w:val="28"/>
+          <w:szCs w:val="28"/>
+        </w:rPr>
+        <w:t xml:space="preserve">Q.11 [line 126] Were the </w:t>
+      </w:r>
+      <w:proofErr w:type="spellStart"/>
+      <w:r>
+        <w:rPr>
+          <w:sz w:val="28"/>
+          <w:szCs w:val="28"/>
+        </w:rPr>
+        <w:t>ParticleClass</w:t>
+      </w:r>
+      <w:proofErr w:type="spellEnd"/>
+      <w:r>
+        <w:rPr>
+          <w:sz w:val="28"/>
+          <w:szCs w:val="28"/>
+        </w:rPr>
+        <w:t xml:space="preserve"> instances deleted? If so, how? </w:t>
       </w:r>
     </w:p>
     <w:p>
@@ -571,7 +713,39 @@
           <w:sz w:val="28"/>
           <w:szCs w:val="28"/>
         </w:rPr>
-        <w:t xml:space="preserve">Q.13 [line 128] Your IDE might suggest to use emplace_back instead of push_back. What does this mean? </w:t>
+        <w:t xml:space="preserve">Q.13 [line 128] Your IDE might suggest to use </w:t>
+      </w:r>
+      <w:proofErr w:type="spellStart"/>
+      <w:r>
+        <w:rPr>
+          <w:sz w:val="28"/>
+          <w:szCs w:val="28"/>
+        </w:rPr>
+        <w:t>emplace_back</w:t>
+      </w:r>
+      <w:proofErr w:type="spellEnd"/>
+      <w:r>
+        <w:rPr>
+          <w:sz w:val="28"/>
+          <w:szCs w:val="28"/>
+        </w:rPr>
+        <w:t xml:space="preserve"> instead of </w:t>
+      </w:r>
+      <w:proofErr w:type="spellStart"/>
+      <w:r>
+        <w:rPr>
+          <w:sz w:val="28"/>
+          <w:szCs w:val="28"/>
+        </w:rPr>
+        <w:t>push_back</w:t>
+      </w:r>
+      <w:proofErr w:type="spellEnd"/>
+      <w:r>
+        <w:rPr>
+          <w:sz w:val="28"/>
+          <w:szCs w:val="28"/>
+        </w:rPr>
+        <w:t xml:space="preserve">. What does this mean? </w:t>
       </w:r>
     </w:p>
     <w:sectPr>

</xml_diff>

<commit_message>
uncommented vector_demo(); and completed q9 to q13
</commit_message>
<xml_diff>
--- a/06 - Lab - Data Structure Basics/Task 06 - Lab Report.docx
+++ b/06 - Lab - Data Structure Basics/Task 06 - Lab Report.docx
@@ -585,7 +585,20 @@
           <w:sz w:val="28"/>
           <w:szCs w:val="28"/>
         </w:rPr>
-        <w:t xml:space="preserve">Q.8 [line 121] Is there a reason to use a list instead of a vector? </w:t>
+        <w:t>Q.8 [line 121] Is there a reason to use a list instead of a vector?</w:t>
+      </w:r>
+    </w:p>
+    <w:p>
+      <w:pPr>
+        <w:spacing w:line="360" w:lineRule="auto"/>
+        <w:ind w:left="720"/>
+        <w:jc w:val="both"/>
+      </w:pPr>
+      <w:r>
+        <w:t>There is, because</w:t>
+      </w:r>
+      <w:r>
+        <w:t xml:space="preserve"> lists provide efficient insertions and deletions in the middle, whereas vectors are efficient for random access. Use a list if you need frequent insertions/deletions not at the end.</w:t>
       </w:r>
     </w:p>
     <w:p>
@@ -623,6 +636,51 @@
     <w:p>
       <w:pPr>
         <w:spacing w:line="360" w:lineRule="auto"/>
+        <w:ind w:left="720"/>
+        <w:jc w:val="both"/>
+      </w:pPr>
+      <w:r>
+        <w:t>No, they</w:t>
+      </w:r>
+      <w:r>
+        <w:t xml:space="preserve"> </w:t>
+      </w:r>
+      <w:r>
+        <w:t>were</w:t>
+      </w:r>
+      <w:r>
+        <w:t xml:space="preserve"> different</w:t>
+      </w:r>
+      <w:r>
+        <w:t xml:space="preserve"> as</w:t>
+      </w:r>
+      <w:r>
+        <w:t xml:space="preserve"> size returns the current number of elements, while </w:t>
+      </w:r>
+      <w:proofErr w:type="spellStart"/>
+      <w:r>
+        <w:t>max_size</w:t>
+      </w:r>
+      <w:proofErr w:type="spellEnd"/>
+      <w:r>
+        <w:t xml:space="preserve"> returns the maximum number of elements a container can accommodate due to </w:t>
+      </w:r>
+      <w:r>
+        <w:t xml:space="preserve">the </w:t>
+      </w:r>
+      <w:r>
+        <w:t xml:space="preserve">system or </w:t>
+      </w:r>
+      <w:r>
+        <w:t xml:space="preserve">the </w:t>
+      </w:r>
+      <w:r>
+        <w:t>library implementation limitations.</w:t>
+      </w:r>
+    </w:p>
+    <w:p>
+      <w:pPr>
+        <w:spacing w:line="360" w:lineRule="auto"/>
         <w:rPr>
           <w:sz w:val="28"/>
           <w:szCs w:val="28"/>
@@ -655,6 +713,68 @@
     <w:p>
       <w:pPr>
         <w:spacing w:line="360" w:lineRule="auto"/>
+        <w:ind w:left="720"/>
+        <w:jc w:val="both"/>
+      </w:pPr>
+      <w:r>
+        <w:t xml:space="preserve">Both </w:t>
+      </w:r>
+      <w:r>
+        <w:t xml:space="preserve">the </w:t>
+      </w:r>
+      <w:r>
+        <w:t>constructors were called</w:t>
+      </w:r>
+      <w:r>
+        <w:t xml:space="preserve"> as</w:t>
+      </w:r>
+      <w:r>
+        <w:t xml:space="preserve"> </w:t>
+      </w:r>
+      <w:r>
+        <w:t>t</w:t>
+      </w:r>
+      <w:r>
+        <w:t xml:space="preserve">he default constructor </w:t>
+      </w:r>
+      <w:r>
+        <w:t>was</w:t>
+      </w:r>
+      <w:r>
+        <w:t xml:space="preserve"> called when the std::array&lt;</w:t>
+      </w:r>
+      <w:proofErr w:type="spellStart"/>
+      <w:r>
+        <w:t>ParticleClass</w:t>
+      </w:r>
+      <w:proofErr w:type="spellEnd"/>
+      <w:r>
+        <w:t>, 3&gt; a1; is defined, and the</w:t>
+      </w:r>
+      <w:r>
+        <w:t>n the</w:t>
+      </w:r>
+      <w:r>
+        <w:t xml:space="preserve"> parameterized constructor </w:t>
+      </w:r>
+      <w:r>
+        <w:t>was</w:t>
+      </w:r>
+      <w:r>
+        <w:t xml:space="preserve"> called when adding items using </w:t>
+      </w:r>
+      <w:proofErr w:type="spellStart"/>
+      <w:r>
+        <w:t>push_back</w:t>
+      </w:r>
+      <w:proofErr w:type="spellEnd"/>
+      <w:r>
+        <w:t>.</w:t>
+      </w:r>
+    </w:p>
+    <w:p>
+      <w:pPr>
+        <w:spacing w:line="360" w:lineRule="auto"/>
         <w:rPr>
           <w:sz w:val="28"/>
           <w:szCs w:val="28"/>
@@ -687,17 +807,102 @@
     <w:p>
       <w:pPr>
         <w:spacing w:line="360" w:lineRule="auto"/>
-        <w:rPr>
-          <w:sz w:val="28"/>
-          <w:szCs w:val="28"/>
-        </w:rPr>
-      </w:pPr>
-      <w:r>
-        <w:rPr>
-          <w:sz w:val="28"/>
-          <w:szCs w:val="28"/>
-        </w:rPr>
-        <w:t xml:space="preserve">Q.12 [line 127] Was the vector instance deleted? If so, how do you know this? </w:t>
+        <w:ind w:left="720"/>
+        <w:jc w:val="both"/>
+      </w:pPr>
+      <w:r>
+        <w:t>Yes,</w:t>
+      </w:r>
+      <w:r>
+        <w:t xml:space="preserve"> they were</w:t>
+      </w:r>
+      <w:r>
+        <w:t xml:space="preserve"> </w:t>
+      </w:r>
+      <w:r>
+        <w:t xml:space="preserve">when they </w:t>
+      </w:r>
+      <w:r>
+        <w:t>went</w:t>
+      </w:r>
+      <w:r>
+        <w:t xml:space="preserve"> out of scope the container holding them </w:t>
+      </w:r>
+      <w:r>
+        <w:t>was</w:t>
+      </w:r>
+      <w:r>
+        <w:t xml:space="preserve"> destroyed</w:t>
+      </w:r>
+      <w:r>
+        <w:t xml:space="preserve"> as</w:t>
+      </w:r>
+      <w:r>
+        <w:t xml:space="preserve"> </w:t>
+      </w:r>
+      <w:r>
+        <w:t>t</w:t>
+      </w:r>
+      <w:r>
+        <w:t>he destructor w</w:t>
+      </w:r>
+      <w:r>
+        <w:t>as</w:t>
+      </w:r>
+      <w:r>
+        <w:t xml:space="preserve"> invoked for each instance.</w:t>
+      </w:r>
+    </w:p>
+    <w:p>
+      <w:pPr>
+        <w:spacing w:line="360" w:lineRule="auto"/>
+        <w:ind w:left="720"/>
+        <w:jc w:val="both"/>
+      </w:pPr>
+    </w:p>
+    <w:p>
+      <w:pPr>
+        <w:spacing w:line="360" w:lineRule="auto"/>
+        <w:rPr>
+          <w:sz w:val="28"/>
+          <w:szCs w:val="28"/>
+        </w:rPr>
+      </w:pPr>
+      <w:r>
+        <w:rPr>
+          <w:sz w:val="28"/>
+          <w:szCs w:val="28"/>
+        </w:rPr>
+        <w:lastRenderedPageBreak/>
+        <w:t>Q.12 [line 127] Was the vector instance deleted? If so, how do you know this?</w:t>
+      </w:r>
+    </w:p>
+    <w:p>
+      <w:pPr>
+        <w:spacing w:line="360" w:lineRule="auto"/>
+        <w:ind w:left="720"/>
+        <w:jc w:val="both"/>
+      </w:pPr>
+      <w:r>
+        <w:t xml:space="preserve">Yes, when the function or scope in which the vector </w:t>
+      </w:r>
+      <w:r>
+        <w:t>was</w:t>
+      </w:r>
+      <w:r>
+        <w:t xml:space="preserve"> defined ends, the vector's destructor </w:t>
+      </w:r>
+      <w:r>
+        <w:t>was</w:t>
+      </w:r>
+      <w:r>
+        <w:t xml:space="preserve"> called</w:t>
+      </w:r>
+      <w:r>
+        <w:t xml:space="preserve"> and</w:t>
+      </w:r>
+      <w:r>
+        <w:t xml:space="preserve"> which in turn calls the destructors of its elements.</w:t>
       </w:r>
     </w:p>
     <w:p>
@@ -747,6 +952,11 @@
         </w:rPr>
         <w:t xml:space="preserve">. What does this mean? </w:t>
       </w:r>
+    </w:p>
+    <w:p>
+      <w:pPr>
+        <w:spacing w:line="360" w:lineRule="auto"/>
+      </w:pPr>
     </w:p>
     <w:sectPr>
       <w:pgSz w:w="12240" w:h="15840"/>

</xml_diff>